<commit_message>
BackEnd finalizado e iniciando o FrontEnd com a página de login finalizada.
</commit_message>
<xml_diff>
--- a/1 - Requisitos Funcionais.docx
+++ b/1 - Requisitos Funcionais.docx
@@ -1986,7 +1986,27 @@
                 <w:szCs w:val="24"/>
                 <w:lang w:eastAsia="pt-BR"/>
               </w:rPr>
-              <w:t>Filtrar histórico por produto.</w:t>
+              <w:t xml:space="preserve">Filtrar histórico por </w:t>
+            </w:r>
+            <w:r>
+              <w:rPr>
+                <w:rFonts w:ascii="Arial" w:eastAsia="Times New Roman" w:hAnsi="Arial" w:cs="Arial"/>
+                <w:color w:val="000000"/>
+                <w:sz w:val="24"/>
+                <w:szCs w:val="24"/>
+                <w:lang w:eastAsia="pt-BR"/>
+              </w:rPr>
+              <w:t xml:space="preserve">nome do </w:t>
+            </w:r>
+            <w:r>
+              <w:rPr>
+                <w:rFonts w:ascii="Arial" w:eastAsia="Times New Roman" w:hAnsi="Arial" w:cs="Arial"/>
+                <w:color w:val="000000"/>
+                <w:sz w:val="24"/>
+                <w:szCs w:val="24"/>
+                <w:lang w:eastAsia="pt-BR"/>
+              </w:rPr>
+              <w:t>produto.</w:t>
             </w:r>
           </w:p>
         </w:tc>
@@ -2353,7 +2373,17 @@
                 <w:szCs w:val="24"/>
                 <w:lang w:eastAsia="pt-BR"/>
               </w:rPr>
-              <w:t>Filtrar os históricos pelo responsável.</w:t>
+              <w:t xml:space="preserve">Filtrar </w:t>
+            </w:r>
+            <w:r>
+              <w:rPr>
+                <w:rFonts w:ascii="Arial" w:eastAsia="Times New Roman" w:hAnsi="Arial" w:cs="Arial"/>
+                <w:color w:val="000000"/>
+                <w:sz w:val="24"/>
+                <w:szCs w:val="24"/>
+                <w:lang w:eastAsia="pt-BR"/>
+              </w:rPr>
+              <w:t>as movimentações pelo produto.</w:t>
             </w:r>
           </w:p>
         </w:tc>
@@ -2393,7 +2423,47 @@
                 <w:szCs w:val="24"/>
                 <w:lang w:eastAsia="pt-BR"/>
               </w:rPr>
-              <w:t>Filtra os históricos a partir do nome do responsável.</w:t>
+              <w:t xml:space="preserve">Filtra </w:t>
+            </w:r>
+            <w:r>
+              <w:rPr>
+                <w:rFonts w:ascii="Arial" w:eastAsia="Times New Roman" w:hAnsi="Arial" w:cs="Arial"/>
+                <w:color w:val="000000"/>
+                <w:sz w:val="24"/>
+                <w:szCs w:val="24"/>
+                <w:lang w:eastAsia="pt-BR"/>
+              </w:rPr>
+              <w:t xml:space="preserve">as movimentações </w:t>
+            </w:r>
+            <w:r>
+              <w:rPr>
+                <w:rFonts w:ascii="Arial" w:eastAsia="Times New Roman" w:hAnsi="Arial" w:cs="Arial"/>
+                <w:color w:val="000000"/>
+                <w:sz w:val="24"/>
+                <w:szCs w:val="24"/>
+                <w:lang w:eastAsia="pt-BR"/>
+              </w:rPr>
+              <w:t xml:space="preserve">a partir do nome do </w:t>
+            </w:r>
+            <w:r>
+              <w:rPr>
+                <w:rFonts w:ascii="Arial" w:eastAsia="Times New Roman" w:hAnsi="Arial" w:cs="Arial"/>
+                <w:color w:val="000000"/>
+                <w:sz w:val="24"/>
+                <w:szCs w:val="24"/>
+                <w:lang w:eastAsia="pt-BR"/>
+              </w:rPr>
+              <w:t>produto</w:t>
+            </w:r>
+            <w:r>
+              <w:rPr>
+                <w:rFonts w:ascii="Arial" w:eastAsia="Times New Roman" w:hAnsi="Arial" w:cs="Arial"/>
+                <w:color w:val="000000"/>
+                <w:sz w:val="24"/>
+                <w:szCs w:val="24"/>
+                <w:lang w:eastAsia="pt-BR"/>
+              </w:rPr>
+              <w:t>.</w:t>
             </w:r>
           </w:p>
         </w:tc>

</xml_diff>